<commit_message>
feat: publish controlled demo entry points
</commit_message>
<xml_diff>
--- a/public/resume/chen-jiawei-ai-agent-cn-two-page.docx
+++ b/public/resume/chen-jiawei-ai-agent-cn-two-page.docx
@@ -762,7 +762,7 @@
           <w:color w:val="111111"/>
           <w:sz w:val="17"/>
         </w:rPr>
-        <w:t>Public Demo 候选｜公网恢复中 / 备用证据可用。</w:t>
+        <w:t>Controlled Demo｜公网前端可访问，后端恢复中；未接通时安全转人工。</w:t>
       </w:r>
     </w:p>
     <w:p>
@@ -909,7 +909,7 @@
           <w:color w:val="111111"/>
           <w:sz w:val="17"/>
         </w:rPr>
-        <w:t>Online Beta 候选｜界面可访问，后端 / 核心编辑链路待在线复核；采用 BYO Key 使用边界。</w:t>
+        <w:t>Controlled Demo｜界面可访问，后端健康 / 核心编辑链路待恢复；采用 BYO Key 使用边界。</w:t>
       </w:r>
     </w:p>
     <w:p>

</xml_diff>

<commit_message>
fix: harden public claims and release evidence
</commit_message>
<xml_diff>
--- a/public/resume/chen-jiawei-ai-agent-cn-two-page.docx
+++ b/public/resume/chen-jiawei-ai-agent-cn-two-page.docx
@@ -76,7 +76,7 @@
                   <w:rFonts w:ascii="Arial" w:hAnsi="Arial" w:eastAsia="Microsoft YaHei"/>
                   <w:sz w:val="17"/>
                 </w:rPr>
-                <w:t>jaelchen.com</w:t>
+                <w:t>作品集</w:t>
               </w:r>
             </w:hyperlink>
             <w:r>
@@ -714,7 +714,7 @@
           <w:color w:val="111111"/>
           <w:sz w:val="17"/>
         </w:rPr>
-        <w:t>589 tests 全量回归（2026-07-28，非准确率）；固定 90 样本离线路由 75/90 = 83.33%。</w:t>
+        <w:t>589 tests 全量回归（2026-07-28，非准确率）；固定 90 样本保留为静态 runner 审计输入。</w:t>
       </w:r>
     </w:p>
     <w:p>
@@ -729,7 +729,7 @@
           <w:color w:val="111111"/>
           <w:sz w:val="17"/>
         </w:rPr>
-        <w:t>安全与评测边界：</w:t>
+        <w:t>评测边界：</w:t>
       </w:r>
       <w:r>
         <w:rPr>
@@ -738,7 +738,7 @@
           <w:color w:val="111111"/>
           <w:sz w:val="17"/>
         </w:rPr>
-        <w:t>高风险错误放行 0、禁止承诺 0；上述结果不是生产准确率，也不是回答总体准确率。</w:t>
+        <w:t>现有 runner 未验证 expected_route、实际澄清节点或生成输出，因此不发布路由准确率、回答正确率或禁止承诺结果。</w:t>
       </w:r>
     </w:p>
     <w:p>

</xml_diff>